<commit_message>
fix(relaunch §0.2): pin NVO revenue to ~$50B — the ~$47B was a price target
The live card reads Revenue $50.17B (TTM to 2026-03-31, DKK→USD at
0.1531). The competing "~$47B" traces to $47.57 — the analyst PRICE
TARGET on that same card — copied across as revenue. Total-company
sales vs one share's projected price; not a rounding disagreement.

Flagship was already correct. Updated the series bible + both
shot-lists ("~$47-50B" → "~$50B") and recorded the finding in the
master + readiness review so it can't silently revert.

Co-Authored-By: Claude Opus 4.8 <noreply@anthropic.com>
</commit_message>
<xml_diff>
--- a/docs/relaunch/AI-Stock-Assist-RELAUNCH-MASTER-CUT-AND-PASTE.docx
+++ b/docs/relaunch/AI-Stock-Assist-RELAUNCH-MASTER-CUT-AND-PASTE.docx
@@ -83,7 +83,7 @@
         <w:pStyle w:val="ListBullet"/>
       </w:pPr>
       <w:r>
-        <w:t>PIN the NVO (Novo Nordisk) USD revenue to ONE number and match it to the publish-day screenshot (flagship says ~$50B, series says ~$47B — reconcile).</w:t>
+        <w:t>PIN the NVO (Novo Nordisk) USD revenue to ONE number — RESOLVED: ~$50B (card reads $50.17B, TTM to 2026-03-31, DKK→USD at 0.1531). The old ~$47B was the analyst PRICE target ($47.57), not revenue.</w:t>
       </w:r>
     </w:p>
     <w:p>
@@ -1098,7 +1098,7 @@
     <w:p/>
     <w:p>
       <w:r>
-        <w:t>SCREENSHOTS: (1) NVO card — FX footnote + revenue ~$47-50B; (2) any card's "Data as of" stamp close-up. Fresh on publish day.</w:t>
+        <w:t>SCREENSHOTS: (1) NVO card — FX footnote + revenue ~$50B; (2) any card's "Data as of" stamp close-up. Fresh on publish day.</w:t>
       </w:r>
     </w:p>
     <w:p>

</xml_diff>